<commit_message>
Checkpoint user changes before layout repair
</commit_message>
<xml_diff>
--- a/论文对比资料_2026-08-23/06_六条件实验论文_2026-08-24/用户修改原稿_前两章_2026-08-24.docx
+++ b/论文对比资料_2026-08-23/06_六条件实验论文_2026-08-24/用户修改原稿_前两章_2026-08-24.docx
@@ -147,7 +147,6 @@
     <w:p>
       <w:pPr>
         <w:rPr>
-          <w:rFonts w:hint="eastAsia"/>
           <w:lang w:eastAsia="zh-CN"/>
         </w:rPr>
       </w:pPr>
@@ -161,7 +160,6 @@
     <w:p>
       <w:pPr>
         <w:rPr>
-          <w:rFonts w:hint="eastAsia"/>
           <w:lang w:eastAsia="zh-CN"/>
         </w:rPr>
       </w:pPr>
@@ -204,7 +202,6 @@
     <w:p>
       <w:pPr>
         <w:rPr>
-          <w:rFonts w:hint="eastAsia"/>
           <w:lang w:eastAsia="zh-CN"/>
         </w:rPr>
       </w:pPr>
@@ -233,7 +230,6 @@
     <w:p>
       <w:pPr>
         <w:rPr>
-          <w:rFonts w:hint="eastAsia"/>
           <w:lang w:eastAsia="zh-CN"/>
         </w:rPr>
       </w:pPr>
@@ -294,7 +290,6 @@
     <w:p>
       <w:pPr>
         <w:rPr>
-          <w:rFonts w:hint="eastAsia"/>
           <w:lang w:eastAsia="zh-CN"/>
         </w:rPr>
       </w:pPr>
@@ -381,7 +376,6 @@
     <w:p>
       <w:pPr>
         <w:rPr>
-          <w:rFonts w:hint="eastAsia"/>
           <w:lang w:eastAsia="zh-CN"/>
         </w:rPr>
       </w:pPr>
@@ -428,7 +422,6 @@
     <w:p>
       <w:pPr>
         <w:rPr>
-          <w:rFonts w:hint="eastAsia"/>
           <w:lang w:eastAsia="zh-CN"/>
         </w:rPr>
       </w:pPr>
@@ -470,7 +463,6 @@
     <w:p>
       <w:pPr>
         <w:rPr>
-          <w:rFonts w:hint="eastAsia"/>
           <w:lang w:eastAsia="zh-CN"/>
         </w:rPr>
       </w:pPr>
@@ -505,7 +497,6 @@
     <w:p>
       <w:pPr>
         <w:rPr>
-          <w:rFonts w:hint="eastAsia"/>
           <w:lang w:eastAsia="zh-CN"/>
         </w:rPr>
       </w:pPr>
@@ -541,7 +532,6 @@
     <w:p>
       <w:pPr>
         <w:rPr>
-          <w:rFonts w:hint="eastAsia"/>
           <w:lang w:eastAsia="zh-CN"/>
         </w:rPr>
       </w:pPr>
@@ -576,7 +566,6 @@
     <w:p>
       <w:pPr>
         <w:rPr>
-          <w:rFonts w:hint="eastAsia"/>
           <w:lang w:eastAsia="zh-CN"/>
         </w:rPr>
       </w:pPr>
@@ -637,7 +626,6 @@
     <w:p>
       <w:pPr>
         <w:rPr>
-          <w:rFonts w:hint="eastAsia"/>
           <w:lang w:eastAsia="zh-CN"/>
         </w:rPr>
       </w:pPr>
@@ -652,14 +640,14 @@
       <w:pPr>
         <w:pStyle w:val="21"/>
         <w:rPr>
-          <w:lang w:eastAsia="zh-CN"/>
-        </w:rPr>
-      </w:pPr>
-      <w:r>
-        <w:rPr>
-          <w:lang w:eastAsia="zh-CN"/>
-        </w:rPr>
-        <w:lastRenderedPageBreak/>
+          <w:rFonts w:eastAsia="宋体"/>
+          <w:lang w:eastAsia="zh-CN"/>
+        </w:rPr>
+      </w:pPr>
+      <w:r>
+        <w:rPr>
+          <w:lang w:eastAsia="zh-CN"/>
+        </w:rPr>
         <w:t>3.2</w:t>
       </w:r>
       <w:r>
@@ -671,22 +659,16 @@
     </w:p>
     <w:p>
       <w:pPr>
-        <w:pStyle w:val="21"/>
-        <w:rPr>
-          <w:lang w:eastAsia="zh-CN"/>
-        </w:rPr>
-      </w:pPr>
-      <w:r>
-        <w:rPr>
-          <w:lang w:eastAsia="zh-CN"/>
-        </w:rPr>
-        <w:t>3.3</w:t>
-      </w:r>
-      <w:r>
-        <w:rPr>
-          <w:lang w:eastAsia="zh-CN"/>
-        </w:rPr>
-        <w:t xml:space="preserve">　受控多规模显示与拖拽实验</w:t>
+        <w:rPr>
+          <w:rFonts w:hint="eastAsia"/>
+          <w:lang w:eastAsia="zh-CN"/>
+        </w:rPr>
+      </w:pPr>
+      <w:r>
+        <w:rPr>
+          <w:lang w:eastAsia="zh-CN"/>
+        </w:rPr>
+        <w:t>五棵确定性生成树分别包含 31、61、121、241 和 364 个资源节点，覆盖小图、 导师所提约 50 节点问题以上的区域，以及逐步增大的压力场景。所有规模使 用相同的广度优先结构规则、节点类型循环和附着 Decorator 比例，分别形成 26、51、101、202 和 305 张画布卡片，使规模成为主要受控差异。</w:t>
       </w:r>
     </w:p>
     <w:p>
@@ -700,13 +682,14 @@
         <w:rPr>
           <w:lang w:eastAsia="zh-CN"/>
         </w:rPr>
-        <w:t>3.4</w:t>
-      </w:r>
-      <w:r>
-        <w:rPr>
-          <w:lang w:eastAsia="zh-CN"/>
-        </w:rPr>
-        <w:t xml:space="preserve">　物理屏幕尺寸实验</w:t>
+        <w:lastRenderedPageBreak/>
+        <w:t>3.3</w:t>
+      </w:r>
+      <w:r>
+        <w:rPr>
+          <w:lang w:eastAsia="zh-CN"/>
+        </w:rPr>
+        <w:t xml:space="preserve">　受控多规模显示与拖拽实验</w:t>
       </w:r>
     </w:p>
     <w:p>
@@ -720,13 +703,13 @@
         <w:rPr>
           <w:lang w:eastAsia="zh-CN"/>
         </w:rPr>
-        <w:t>3.5</w:t>
-      </w:r>
-      <w:r>
-        <w:rPr>
-          <w:lang w:eastAsia="zh-CN"/>
-        </w:rPr>
-        <w:t xml:space="preserve">　可玩树生态显示校验</w:t>
+        <w:t>3.4</w:t>
+      </w:r>
+      <w:r>
+        <w:rPr>
+          <w:lang w:eastAsia="zh-CN"/>
+        </w:rPr>
+        <w:t xml:space="preserve">　物理屏幕尺寸实验</w:t>
       </w:r>
     </w:p>
     <w:p>
@@ -740,13 +723,13 @@
         <w:rPr>
           <w:lang w:eastAsia="zh-CN"/>
         </w:rPr>
-        <w:t>3.6</w:t>
-      </w:r>
-      <w:r>
-        <w:rPr>
-          <w:lang w:eastAsia="zh-CN"/>
-        </w:rPr>
-        <w:t xml:space="preserve">　正确性与集成评估</w:t>
+        <w:t>3.5</w:t>
+      </w:r>
+      <w:r>
+        <w:rPr>
+          <w:lang w:eastAsia="zh-CN"/>
+        </w:rPr>
+        <w:t xml:space="preserve">　可玩树生态显示校验</w:t>
       </w:r>
     </w:p>
     <w:p>
@@ -760,13 +743,13 @@
         <w:rPr>
           <w:lang w:eastAsia="zh-CN"/>
         </w:rPr>
-        <w:t>3.7</w:t>
-      </w:r>
-      <w:r>
-        <w:rPr>
-          <w:lang w:eastAsia="zh-CN"/>
-        </w:rPr>
-        <w:t xml:space="preserve">　视觉验证</w:t>
+        <w:t>3.6</w:t>
+      </w:r>
+      <w:r>
+        <w:rPr>
+          <w:lang w:eastAsia="zh-CN"/>
+        </w:rPr>
+        <w:t xml:space="preserve">　正确性与集成评估</w:t>
       </w:r>
     </w:p>
     <w:p>
@@ -780,13 +763,13 @@
         <w:rPr>
           <w:lang w:eastAsia="zh-CN"/>
         </w:rPr>
-        <w:t>3.8</w:t>
-      </w:r>
-      <w:r>
-        <w:rPr>
-          <w:lang w:eastAsia="zh-CN"/>
-        </w:rPr>
-        <w:t xml:space="preserve">　可选未来人体验证</w:t>
+        <w:t>3.7</w:t>
+      </w:r>
+      <w:r>
+        <w:rPr>
+          <w:lang w:eastAsia="zh-CN"/>
+        </w:rPr>
+        <w:t xml:space="preserve">　视觉验证</w:t>
       </w:r>
     </w:p>
     <w:p>
@@ -800,59 +783,59 @@
         <w:rPr>
           <w:lang w:eastAsia="zh-CN"/>
         </w:rPr>
-        <w:t>3.9</w:t>
-      </w:r>
-      <w:r>
-        <w:rPr>
-          <w:lang w:eastAsia="zh-CN"/>
-        </w:rPr>
-        <w:t xml:space="preserve">　有效性与可复现性</w:t>
+        <w:t>3.8</w:t>
+      </w:r>
+      <w:r>
+        <w:rPr>
+          <w:lang w:eastAsia="zh-CN"/>
+        </w:rPr>
+        <w:t xml:space="preserve">　可选未来人体验证</w:t>
       </w:r>
     </w:p>
     <w:p>
       <w:pPr>
-        <w:pStyle w:val="1"/>
-        <w:rPr>
-          <w:lang w:eastAsia="zh-CN"/>
-        </w:rPr>
-      </w:pPr>
-      <w:r>
-        <w:rPr>
-          <w:lang w:eastAsia="zh-CN"/>
-        </w:rPr>
-        <w:t>第</w:t>
-      </w:r>
-      <w:r>
-        <w:rPr>
-          <w:lang w:eastAsia="zh-CN"/>
-        </w:rPr>
-        <w:t>4</w:t>
-      </w:r>
-      <w:r>
-        <w:rPr>
-          <w:lang w:eastAsia="zh-CN"/>
-        </w:rPr>
-        <w:t>章　系统设计与实现</w:t>
+        <w:pStyle w:val="21"/>
+        <w:rPr>
+          <w:lang w:eastAsia="zh-CN"/>
+        </w:rPr>
+      </w:pPr>
+      <w:r>
+        <w:rPr>
+          <w:lang w:eastAsia="zh-CN"/>
+        </w:rPr>
+        <w:t>3.9</w:t>
+      </w:r>
+      <w:r>
+        <w:rPr>
+          <w:lang w:eastAsia="zh-CN"/>
+        </w:rPr>
+        <w:t xml:space="preserve">　有效性与可复现性</w:t>
       </w:r>
     </w:p>
     <w:p>
       <w:pPr>
-        <w:pStyle w:val="21"/>
-        <w:rPr>
-          <w:lang w:eastAsia="zh-CN"/>
-        </w:rPr>
-      </w:pPr>
-      <w:r>
-        <w:rPr>
-          <w:lang w:eastAsia="zh-CN"/>
-        </w:rPr>
-        <w:t>4.1</w:t>
-      </w:r>
-      <w:r>
-        <w:rPr>
-          <w:lang w:eastAsia="zh-CN"/>
-        </w:rPr>
-        <w:t xml:space="preserve">　架构与项目边界</w:t>
+        <w:pStyle w:val="1"/>
+        <w:rPr>
+          <w:lang w:eastAsia="zh-CN"/>
+        </w:rPr>
+      </w:pPr>
+      <w:r>
+        <w:rPr>
+          <w:lang w:eastAsia="zh-CN"/>
+        </w:rPr>
+        <w:t>第</w:t>
+      </w:r>
+      <w:r>
+        <w:rPr>
+          <w:lang w:eastAsia="zh-CN"/>
+        </w:rPr>
+        <w:t>4</w:t>
+      </w:r>
+      <w:r>
+        <w:rPr>
+          <w:lang w:eastAsia="zh-CN"/>
+        </w:rPr>
+        <w:t>章　系统设计与实现</w:t>
       </w:r>
     </w:p>
     <w:p>
@@ -866,13 +849,13 @@
         <w:rPr>
           <w:lang w:eastAsia="zh-CN"/>
         </w:rPr>
-        <w:t>4.2</w:t>
-      </w:r>
-      <w:r>
-        <w:rPr>
-          <w:lang w:eastAsia="zh-CN"/>
-        </w:rPr>
-        <w:t xml:space="preserve">　资源模型与校验</w:t>
+        <w:t>4.1</w:t>
+      </w:r>
+      <w:r>
+        <w:rPr>
+          <w:lang w:eastAsia="zh-CN"/>
+        </w:rPr>
+        <w:t xml:space="preserve">　架构与项目边界</w:t>
       </w:r>
     </w:p>
     <w:p>
@@ -886,13 +869,13 @@
         <w:rPr>
           <w:lang w:eastAsia="zh-CN"/>
         </w:rPr>
-        <w:t>4.3</w:t>
-      </w:r>
-      <w:r>
-        <w:rPr>
-          <w:lang w:eastAsia="zh-CN"/>
-        </w:rPr>
-        <w:t xml:space="preserve">　运行时语义</w:t>
+        <w:t>4.2</w:t>
+      </w:r>
+      <w:r>
+        <w:rPr>
+          <w:lang w:eastAsia="zh-CN"/>
+        </w:rPr>
+        <w:t xml:space="preserve">　资源模型与校验</w:t>
       </w:r>
     </w:p>
     <w:p>
@@ -906,13 +889,13 @@
         <w:rPr>
           <w:lang w:eastAsia="zh-CN"/>
         </w:rPr>
-        <w:t>4.4</w:t>
-      </w:r>
-      <w:r>
-        <w:rPr>
-          <w:lang w:eastAsia="zh-CN"/>
-        </w:rPr>
-        <w:t xml:space="preserve">　编辑器编写工作流</w:t>
+        <w:t>4.3</w:t>
+      </w:r>
+      <w:r>
+        <w:rPr>
+          <w:lang w:eastAsia="zh-CN"/>
+        </w:rPr>
+        <w:t xml:space="preserve">　运行时语义</w:t>
       </w:r>
     </w:p>
     <w:p>
@@ -926,25 +909,13 @@
         <w:rPr>
           <w:lang w:eastAsia="zh-CN"/>
         </w:rPr>
-        <w:t>4.5</w:t>
-      </w:r>
-      <w:r>
-        <w:rPr>
-          <w:lang w:eastAsia="zh-CN"/>
-        </w:rPr>
-        <w:t xml:space="preserve">　</w:t>
-      </w:r>
-      <w:r>
-        <w:rPr>
-          <w:lang w:eastAsia="zh-CN"/>
-        </w:rPr>
-        <w:t xml:space="preserve">Live Debug </w:t>
-      </w:r>
-      <w:r>
-        <w:rPr>
-          <w:lang w:eastAsia="zh-CN"/>
-        </w:rPr>
-        <w:t>与黑板检查</w:t>
+        <w:t>4.4</w:t>
+      </w:r>
+      <w:r>
+        <w:rPr>
+          <w:lang w:eastAsia="zh-CN"/>
+        </w:rPr>
+        <w:t xml:space="preserve">　编辑器编写工作流</w:t>
       </w:r>
     </w:p>
     <w:p>
@@ -958,33 +929,45 @@
         <w:rPr>
           <w:lang w:eastAsia="zh-CN"/>
         </w:rPr>
-        <w:t>4.6</w:t>
-      </w:r>
-      <w:r>
-        <w:rPr>
-          <w:lang w:eastAsia="zh-CN"/>
-        </w:rPr>
-        <w:t xml:space="preserve">　大型树显示机制</w:t>
+        <w:t>4.5</w:t>
+      </w:r>
+      <w:r>
+        <w:rPr>
+          <w:lang w:eastAsia="zh-CN"/>
+        </w:rPr>
+        <w:t xml:space="preserve">　</w:t>
+      </w:r>
+      <w:r>
+        <w:rPr>
+          <w:lang w:eastAsia="zh-CN"/>
+        </w:rPr>
+        <w:t xml:space="preserve">Live Debug </w:t>
+      </w:r>
+      <w:r>
+        <w:rPr>
+          <w:lang w:eastAsia="zh-CN"/>
+        </w:rPr>
+        <w:t>与黑板检查</w:t>
       </w:r>
     </w:p>
     <w:p>
       <w:pPr>
-        <w:pStyle w:val="31"/>
-        <w:rPr>
-          <w:lang w:eastAsia="zh-CN"/>
-        </w:rPr>
-      </w:pPr>
-      <w:r>
-        <w:rPr>
-          <w:lang w:eastAsia="zh-CN"/>
-        </w:rPr>
-        <w:t>4.6.1</w:t>
-      </w:r>
-      <w:r>
-        <w:rPr>
-          <w:lang w:eastAsia="zh-CN"/>
-        </w:rPr>
-        <w:t xml:space="preserve">　信息密度控制</w:t>
+        <w:pStyle w:val="21"/>
+        <w:rPr>
+          <w:lang w:eastAsia="zh-CN"/>
+        </w:rPr>
+      </w:pPr>
+      <w:r>
+        <w:rPr>
+          <w:lang w:eastAsia="zh-CN"/>
+        </w:rPr>
+        <w:t>4.6</w:t>
+      </w:r>
+      <w:r>
+        <w:rPr>
+          <w:lang w:eastAsia="zh-CN"/>
+        </w:rPr>
+        <w:t xml:space="preserve">　大型树显示机制</w:t>
       </w:r>
     </w:p>
     <w:p>
@@ -998,13 +981,13 @@
         <w:rPr>
           <w:lang w:eastAsia="zh-CN"/>
         </w:rPr>
-        <w:t>4.6.2</w:t>
-      </w:r>
-      <w:r>
-        <w:rPr>
-          <w:lang w:eastAsia="zh-CN"/>
-        </w:rPr>
-        <w:t xml:space="preserve">　焦点与结构裁剪</w:t>
+        <w:t>4.6.1</w:t>
+      </w:r>
+      <w:r>
+        <w:rPr>
+          <w:lang w:eastAsia="zh-CN"/>
+        </w:rPr>
+        <w:t xml:space="preserve">　信息密度控制</w:t>
       </w:r>
     </w:p>
     <w:p>
@@ -1018,13 +1001,13 @@
         <w:rPr>
           <w:lang w:eastAsia="zh-CN"/>
         </w:rPr>
-        <w:t>4.6.3</w:t>
-      </w:r>
-      <w:r>
-        <w:rPr>
-          <w:lang w:eastAsia="zh-CN"/>
-        </w:rPr>
-        <w:t xml:space="preserve">　导航与概览</w:t>
+        <w:t>4.6.2</w:t>
+      </w:r>
+      <w:r>
+        <w:rPr>
+          <w:lang w:eastAsia="zh-CN"/>
+        </w:rPr>
+        <w:t xml:space="preserve">　焦点与结构裁剪</w:t>
       </w:r>
     </w:p>
     <w:p>
@@ -1038,34 +1021,33 @@
         <w:rPr>
           <w:lang w:eastAsia="zh-CN"/>
         </w:rPr>
-        <w:lastRenderedPageBreak/>
-        <w:t>4.6.4</w:t>
-      </w:r>
-      <w:r>
-        <w:rPr>
-          <w:lang w:eastAsia="zh-CN"/>
-        </w:rPr>
-        <w:t xml:space="preserve">　连线与运行表示</w:t>
+        <w:t>4.6.3</w:t>
+      </w:r>
+      <w:r>
+        <w:rPr>
+          <w:lang w:eastAsia="zh-CN"/>
+        </w:rPr>
+        <w:t xml:space="preserve">　导航与概览</w:t>
       </w:r>
     </w:p>
     <w:p>
       <w:pPr>
-        <w:pStyle w:val="21"/>
-        <w:rPr>
-          <w:lang w:eastAsia="zh-CN"/>
-        </w:rPr>
-      </w:pPr>
-      <w:r>
-        <w:rPr>
-          <w:lang w:eastAsia="zh-CN"/>
-        </w:rPr>
-        <w:t>4.7</w:t>
-      </w:r>
-      <w:r>
-        <w:rPr>
-          <w:lang w:eastAsia="zh-CN"/>
-        </w:rPr>
-        <w:t xml:space="preserve">　物理屏幕实验基础设施</w:t>
+        <w:pStyle w:val="31"/>
+        <w:rPr>
+          <w:lang w:eastAsia="zh-CN"/>
+        </w:rPr>
+      </w:pPr>
+      <w:r>
+        <w:rPr>
+          <w:lang w:eastAsia="zh-CN"/>
+        </w:rPr>
+        <w:t>4.6.4</w:t>
+      </w:r>
+      <w:r>
+        <w:rPr>
+          <w:lang w:eastAsia="zh-CN"/>
+        </w:rPr>
+        <w:t xml:space="preserve">　连线与运行表示</w:t>
       </w:r>
     </w:p>
     <w:p>
@@ -1079,59 +1061,60 @@
         <w:rPr>
           <w:lang w:eastAsia="zh-CN"/>
         </w:rPr>
-        <w:t>4.8</w:t>
-      </w:r>
-      <w:r>
-        <w:rPr>
-          <w:lang w:eastAsia="zh-CN"/>
-        </w:rPr>
-        <w:t xml:space="preserve">　演示游戏</w:t>
+        <w:t>4.7</w:t>
+      </w:r>
+      <w:r>
+        <w:rPr>
+          <w:lang w:eastAsia="zh-CN"/>
+        </w:rPr>
+        <w:t xml:space="preserve">　物理屏幕实验基础设施</w:t>
       </w:r>
     </w:p>
     <w:p>
       <w:pPr>
-        <w:pStyle w:val="1"/>
-        <w:rPr>
-          <w:lang w:eastAsia="zh-CN"/>
-        </w:rPr>
-      </w:pPr>
-      <w:r>
-        <w:rPr>
-          <w:lang w:eastAsia="zh-CN"/>
-        </w:rPr>
-        <w:t>第</w:t>
-      </w:r>
-      <w:r>
-        <w:rPr>
-          <w:lang w:eastAsia="zh-CN"/>
-        </w:rPr>
-        <w:t>5</w:t>
-      </w:r>
-      <w:r>
-        <w:rPr>
-          <w:lang w:eastAsia="zh-CN"/>
-        </w:rPr>
-        <w:t>章　结果与分析</w:t>
+        <w:pStyle w:val="21"/>
+        <w:rPr>
+          <w:lang w:eastAsia="zh-CN"/>
+        </w:rPr>
+      </w:pPr>
+      <w:r>
+        <w:rPr>
+          <w:lang w:eastAsia="zh-CN"/>
+        </w:rPr>
+        <w:lastRenderedPageBreak/>
+        <w:t>4.8</w:t>
+      </w:r>
+      <w:r>
+        <w:rPr>
+          <w:lang w:eastAsia="zh-CN"/>
+        </w:rPr>
+        <w:t xml:space="preserve">　演示游戏</w:t>
       </w:r>
     </w:p>
     <w:p>
       <w:pPr>
-        <w:pStyle w:val="21"/>
-        <w:rPr>
-          <w:lang w:eastAsia="zh-CN"/>
-        </w:rPr>
-      </w:pPr>
-      <w:r>
-        <w:rPr>
-          <w:lang w:eastAsia="zh-CN"/>
-        </w:rPr>
-        <w:t>5.1</w:t>
-      </w:r>
-      <w:r>
-        <w:rPr>
-          <w:lang w:eastAsia="zh-CN"/>
-        </w:rPr>
-        <w:t xml:space="preserve">　功能正确性</w:t>
+        <w:pStyle w:val="1"/>
+        <w:rPr>
+          <w:lang w:eastAsia="zh-CN"/>
+        </w:rPr>
+      </w:pPr>
+      <w:r>
+        <w:rPr>
+          <w:lang w:eastAsia="zh-CN"/>
+        </w:rPr>
+        <w:t>第</w:t>
+      </w:r>
+      <w:r>
+        <w:rPr>
+          <w:lang w:eastAsia="zh-CN"/>
+        </w:rPr>
+        <w:t>5</w:t>
+      </w:r>
+      <w:r>
+        <w:rPr>
+          <w:lang w:eastAsia="zh-CN"/>
+        </w:rPr>
+        <w:t>章　结果与分析</w:t>
       </w:r>
     </w:p>
     <w:p>
@@ -1145,13 +1128,13 @@
         <w:rPr>
           <w:lang w:eastAsia="zh-CN"/>
         </w:rPr>
-        <w:t>5.2</w:t>
-      </w:r>
-      <w:r>
-        <w:rPr>
-          <w:lang w:eastAsia="zh-CN"/>
-        </w:rPr>
-        <w:t xml:space="preserve">　受控多规模显示结果</w:t>
+        <w:t>5.1</w:t>
+      </w:r>
+      <w:r>
+        <w:rPr>
+          <w:lang w:eastAsia="zh-CN"/>
+        </w:rPr>
+        <w:t xml:space="preserve">　功能正确性</w:t>
       </w:r>
     </w:p>
     <w:p>
@@ -1165,13 +1148,13 @@
         <w:rPr>
           <w:lang w:eastAsia="zh-CN"/>
         </w:rPr>
-        <w:t>5.3</w:t>
-      </w:r>
-      <w:r>
-        <w:rPr>
-          <w:lang w:eastAsia="zh-CN"/>
-        </w:rPr>
-        <w:t xml:space="preserve">　物理屏幕尺寸结果</w:t>
+        <w:t>5.2</w:t>
+      </w:r>
+      <w:r>
+        <w:rPr>
+          <w:lang w:eastAsia="zh-CN"/>
+        </w:rPr>
+        <w:t xml:space="preserve">　受控多规模显示结果</w:t>
       </w:r>
     </w:p>
     <w:p>
@@ -1185,13 +1168,13 @@
         <w:rPr>
           <w:lang w:eastAsia="zh-CN"/>
         </w:rPr>
-        <w:t>5.4</w:t>
-      </w:r>
-      <w:r>
-        <w:rPr>
-          <w:lang w:eastAsia="zh-CN"/>
-        </w:rPr>
-        <w:t xml:space="preserve">　版本化拖拽交互结果</w:t>
+        <w:t>5.3</w:t>
+      </w:r>
+      <w:r>
+        <w:rPr>
+          <w:lang w:eastAsia="zh-CN"/>
+        </w:rPr>
+        <w:t xml:space="preserve">　物理屏幕尺寸结果</w:t>
       </w:r>
     </w:p>
     <w:p>
@@ -1205,25 +1188,13 @@
         <w:rPr>
           <w:lang w:eastAsia="zh-CN"/>
         </w:rPr>
-        <w:t>5.5</w:t>
-      </w:r>
-      <w:r>
-        <w:rPr>
-          <w:lang w:eastAsia="zh-CN"/>
-        </w:rPr>
-        <w:t xml:space="preserve">　可玩</w:t>
-      </w:r>
-      <w:r>
-        <w:rPr>
-          <w:lang w:eastAsia="zh-CN"/>
-        </w:rPr>
-        <w:t xml:space="preserve"> 241 </w:t>
-      </w:r>
-      <w:r>
-        <w:rPr>
-          <w:lang w:eastAsia="zh-CN"/>
-        </w:rPr>
-        <w:t>节点树显示结果</w:t>
+        <w:t>5.4</w:t>
+      </w:r>
+      <w:r>
+        <w:rPr>
+          <w:lang w:eastAsia="zh-CN"/>
+        </w:rPr>
+        <w:t xml:space="preserve">　版本化拖拽交互结果</w:t>
       </w:r>
     </w:p>
     <w:p>
@@ -1237,13 +1208,25 @@
         <w:rPr>
           <w:lang w:eastAsia="zh-CN"/>
         </w:rPr>
-        <w:t>5.6</w:t>
-      </w:r>
-      <w:r>
-        <w:rPr>
-          <w:lang w:eastAsia="zh-CN"/>
-        </w:rPr>
-        <w:t xml:space="preserve">　路径与概览结果</w:t>
+        <w:t>5.5</w:t>
+      </w:r>
+      <w:r>
+        <w:rPr>
+          <w:lang w:eastAsia="zh-CN"/>
+        </w:rPr>
+        <w:t xml:space="preserve">　可玩</w:t>
+      </w:r>
+      <w:r>
+        <w:rPr>
+          <w:lang w:eastAsia="zh-CN"/>
+        </w:rPr>
+        <w:t xml:space="preserve"> 241 </w:t>
+      </w:r>
+      <w:r>
+        <w:rPr>
+          <w:lang w:eastAsia="zh-CN"/>
+        </w:rPr>
+        <w:t>节点树显示结果</w:t>
       </w:r>
     </w:p>
     <w:p>
@@ -1257,13 +1240,13 @@
         <w:rPr>
           <w:lang w:eastAsia="zh-CN"/>
         </w:rPr>
-        <w:t>5.7</w:t>
-      </w:r>
-      <w:r>
-        <w:rPr>
-          <w:lang w:eastAsia="zh-CN"/>
-        </w:rPr>
-        <w:t xml:space="preserve">　视觉回归发现</w:t>
+        <w:t>5.6</w:t>
+      </w:r>
+      <w:r>
+        <w:rPr>
+          <w:lang w:eastAsia="zh-CN"/>
+        </w:rPr>
+        <w:t xml:space="preserve">　路径与概览结果</w:t>
       </w:r>
     </w:p>
     <w:p>
@@ -1277,13 +1260,13 @@
         <w:rPr>
           <w:lang w:eastAsia="zh-CN"/>
         </w:rPr>
-        <w:t>5.8</w:t>
-      </w:r>
-      <w:r>
-        <w:rPr>
-          <w:lang w:eastAsia="zh-CN"/>
-        </w:rPr>
-        <w:t xml:space="preserve">　人体可用性证据边界</w:t>
+        <w:t>5.7</w:t>
+      </w:r>
+      <w:r>
+        <w:rPr>
+          <w:lang w:eastAsia="zh-CN"/>
+        </w:rPr>
+        <w:t xml:space="preserve">　视觉回归发现</w:t>
       </w:r>
     </w:p>
     <w:p>
@@ -1297,59 +1280,59 @@
         <w:rPr>
           <w:lang w:eastAsia="zh-CN"/>
         </w:rPr>
-        <w:t>5.9</w:t>
-      </w:r>
-      <w:r>
-        <w:rPr>
-          <w:lang w:eastAsia="zh-CN"/>
-        </w:rPr>
-        <w:t xml:space="preserve">　对应研究问题的结果</w:t>
+        <w:t>5.8</w:t>
+      </w:r>
+      <w:r>
+        <w:rPr>
+          <w:lang w:eastAsia="zh-CN"/>
+        </w:rPr>
+        <w:t xml:space="preserve">　人体可用性证据边界</w:t>
       </w:r>
     </w:p>
     <w:p>
       <w:pPr>
-        <w:pStyle w:val="1"/>
-        <w:rPr>
-          <w:lang w:eastAsia="zh-CN"/>
-        </w:rPr>
-      </w:pPr>
-      <w:r>
-        <w:rPr>
-          <w:lang w:eastAsia="zh-CN"/>
-        </w:rPr>
-        <w:t>第</w:t>
-      </w:r>
-      <w:r>
-        <w:rPr>
-          <w:lang w:eastAsia="zh-CN"/>
-        </w:rPr>
-        <w:t>6</w:t>
-      </w:r>
-      <w:r>
-        <w:rPr>
-          <w:lang w:eastAsia="zh-CN"/>
-        </w:rPr>
-        <w:t>章　讨论</w:t>
+        <w:pStyle w:val="21"/>
+        <w:rPr>
+          <w:lang w:eastAsia="zh-CN"/>
+        </w:rPr>
+      </w:pPr>
+      <w:r>
+        <w:rPr>
+          <w:lang w:eastAsia="zh-CN"/>
+        </w:rPr>
+        <w:t>5.9</w:t>
+      </w:r>
+      <w:r>
+        <w:rPr>
+          <w:lang w:eastAsia="zh-CN"/>
+        </w:rPr>
+        <w:t xml:space="preserve">　对应研究问题的结果</w:t>
       </w:r>
     </w:p>
     <w:p>
       <w:pPr>
-        <w:pStyle w:val="21"/>
-        <w:rPr>
-          <w:lang w:eastAsia="zh-CN"/>
-        </w:rPr>
-      </w:pPr>
-      <w:r>
-        <w:rPr>
-          <w:lang w:eastAsia="zh-CN"/>
-        </w:rPr>
-        <w:t>6.1</w:t>
-      </w:r>
-      <w:r>
-        <w:rPr>
-          <w:lang w:eastAsia="zh-CN"/>
-        </w:rPr>
-        <w:t xml:space="preserve">　实验平台的正确性与边界</w:t>
+        <w:pStyle w:val="1"/>
+        <w:rPr>
+          <w:lang w:eastAsia="zh-CN"/>
+        </w:rPr>
+      </w:pPr>
+      <w:r>
+        <w:rPr>
+          <w:lang w:eastAsia="zh-CN"/>
+        </w:rPr>
+        <w:t>第</w:t>
+      </w:r>
+      <w:r>
+        <w:rPr>
+          <w:lang w:eastAsia="zh-CN"/>
+        </w:rPr>
+        <w:t>6</w:t>
+      </w:r>
+      <w:r>
+        <w:rPr>
+          <w:lang w:eastAsia="zh-CN"/>
+        </w:rPr>
+        <w:t>章　讨论</w:t>
       </w:r>
     </w:p>
     <w:p>
@@ -1363,13 +1346,13 @@
         <w:rPr>
           <w:lang w:eastAsia="zh-CN"/>
         </w:rPr>
-        <w:t>6.2</w:t>
-      </w:r>
-      <w:r>
-        <w:rPr>
-          <w:lang w:eastAsia="zh-CN"/>
-        </w:rPr>
-        <w:t xml:space="preserve">　显示结果的解释</w:t>
+        <w:t>6.1</w:t>
+      </w:r>
+      <w:r>
+        <w:rPr>
+          <w:lang w:eastAsia="zh-CN"/>
+        </w:rPr>
+        <w:t xml:space="preserve">　实验平台的正确性与边界</w:t>
       </w:r>
     </w:p>
     <w:p>
@@ -1383,25 +1366,13 @@
         <w:rPr>
           <w:lang w:eastAsia="zh-CN"/>
         </w:rPr>
-        <w:t>6.3</w:t>
-      </w:r>
-      <w:r>
-        <w:rPr>
-          <w:lang w:eastAsia="zh-CN"/>
-        </w:rPr>
-        <w:t xml:space="preserve">　</w:t>
-      </w:r>
-      <w:r>
-        <w:rPr>
-          <w:lang w:eastAsia="zh-CN"/>
-        </w:rPr>
-        <w:t xml:space="preserve">Live Debug </w:t>
-      </w:r>
-      <w:r>
-        <w:rPr>
-          <w:lang w:eastAsia="zh-CN"/>
-        </w:rPr>
-        <w:t>作为可读性机制</w:t>
+        <w:t>6.2</w:t>
+      </w:r>
+      <w:r>
+        <w:rPr>
+          <w:lang w:eastAsia="zh-CN"/>
+        </w:rPr>
+        <w:t xml:space="preserve">　显示结果的解释</w:t>
       </w:r>
     </w:p>
     <w:p>
@@ -1415,13 +1386,25 @@
         <w:rPr>
           <w:lang w:eastAsia="zh-CN"/>
         </w:rPr>
-        <w:t>6.4</w:t>
-      </w:r>
-      <w:r>
-        <w:rPr>
-          <w:lang w:eastAsia="zh-CN"/>
-        </w:rPr>
-        <w:t xml:space="preserve">　可靠性与发布</w:t>
+        <w:t>6.3</w:t>
+      </w:r>
+      <w:r>
+        <w:rPr>
+          <w:lang w:eastAsia="zh-CN"/>
+        </w:rPr>
+        <w:t xml:space="preserve">　</w:t>
+      </w:r>
+      <w:r>
+        <w:rPr>
+          <w:lang w:eastAsia="zh-CN"/>
+        </w:rPr>
+        <w:t xml:space="preserve">Live Debug </w:t>
+      </w:r>
+      <w:r>
+        <w:rPr>
+          <w:lang w:eastAsia="zh-CN"/>
+        </w:rPr>
+        <w:t>作为可读性机制</w:t>
       </w:r>
     </w:p>
     <w:p>
@@ -1435,34 +1418,33 @@
         <w:rPr>
           <w:lang w:eastAsia="zh-CN"/>
         </w:rPr>
-        <w:lastRenderedPageBreak/>
-        <w:t>6.5</w:t>
-      </w:r>
-      <w:r>
-        <w:rPr>
-          <w:lang w:eastAsia="zh-CN"/>
-        </w:rPr>
-        <w:t xml:space="preserve">　有效性威胁</w:t>
+        <w:t>6.4</w:t>
+      </w:r>
+      <w:r>
+        <w:rPr>
+          <w:lang w:eastAsia="zh-CN"/>
+        </w:rPr>
+        <w:t xml:space="preserve">　可靠性与发布</w:t>
       </w:r>
     </w:p>
     <w:p>
       <w:pPr>
-        <w:pStyle w:val="31"/>
-        <w:rPr>
-          <w:lang w:eastAsia="zh-CN"/>
-        </w:rPr>
-      </w:pPr>
-      <w:r>
-        <w:rPr>
-          <w:lang w:eastAsia="zh-CN"/>
-        </w:rPr>
-        <w:t>6.5.1</w:t>
-      </w:r>
-      <w:r>
-        <w:rPr>
-          <w:lang w:eastAsia="zh-CN"/>
-        </w:rPr>
-        <w:t xml:space="preserve">　构念有效性</w:t>
+        <w:pStyle w:val="21"/>
+        <w:rPr>
+          <w:lang w:eastAsia="zh-CN"/>
+        </w:rPr>
+      </w:pPr>
+      <w:r>
+        <w:rPr>
+          <w:lang w:eastAsia="zh-CN"/>
+        </w:rPr>
+        <w:t>6.5</w:t>
+      </w:r>
+      <w:r>
+        <w:rPr>
+          <w:lang w:eastAsia="zh-CN"/>
+        </w:rPr>
+        <w:t xml:space="preserve">　有效性威胁</w:t>
       </w:r>
     </w:p>
     <w:p>
@@ -1476,6 +1458,27 @@
         <w:rPr>
           <w:lang w:eastAsia="zh-CN"/>
         </w:rPr>
+        <w:t>6.5.1</w:t>
+      </w:r>
+      <w:r>
+        <w:rPr>
+          <w:lang w:eastAsia="zh-CN"/>
+        </w:rPr>
+        <w:t xml:space="preserve">　构念有效性</w:t>
+      </w:r>
+    </w:p>
+    <w:p>
+      <w:pPr>
+        <w:pStyle w:val="31"/>
+        <w:rPr>
+          <w:lang w:eastAsia="zh-CN"/>
+        </w:rPr>
+      </w:pPr>
+      <w:r>
+        <w:rPr>
+          <w:lang w:eastAsia="zh-CN"/>
+        </w:rPr>
+        <w:lastRenderedPageBreak/>
         <w:t>6.5.2</w:t>
       </w:r>
       <w:r>

</xml_diff>